<commit_message>
Create initial version of Augment, complete forecast.py
Update CPI historical input and supporting input files.
</commit_message>
<xml_diff>
--- a/PySupport/AdjustedNasdaq/docs/CPI_Model.docx
+++ b/PySupport/AdjustedNasdaq/docs/CPI_Model.docx
@@ -60,9 +60,55 @@
           <w:b/>
           <w:bCs/>
         </w:rPr>
-        <w:t>forecast_</w:t>
-      </w:r>
-      <w:proofErr w:type="gramStart"/>
+        <w:t>forecast_cpi</w:t>
+      </w:r>
+      <w:r>
+        <w:t>“  that</w:t>
+      </w:r>
+      <w:r>
+        <w:t xml:space="preserve"> </w:t>
+      </w:r>
+      <w:r>
+        <w:t>accept</w:t>
+      </w:r>
+      <w:r>
+        <w:t>s</w:t>
+      </w:r>
+      <w:r>
+        <w:t xml:space="preserve"> a </w:t>
+      </w:r>
+      <w:r>
+        <w:t xml:space="preserve">pandas </w:t>
+      </w:r>
+      <w:r>
+        <w:t xml:space="preserve">dataframe </w:t>
+      </w:r>
+      <w:r>
+        <w:t>parameter (</w:t>
+      </w:r>
+      <w:r>
+        <w:rPr>
+          <w:b/>
+          <w:bCs/>
+        </w:rPr>
+        <w:t>df</w:t>
+      </w:r>
+      <w:r>
+        <w:t xml:space="preserve">) </w:t>
+      </w:r>
+      <w:r>
+        <w:t xml:space="preserve">with two columns: </w:t>
+      </w:r>
+      <w:r>
+        <w:rPr>
+          <w:b/>
+          <w:bCs/>
+        </w:rPr>
+        <w:t>date</w:t>
+      </w:r>
+      <w:r>
+        <w:t xml:space="preserve"> and </w:t>
+      </w:r>
       <w:r>
         <w:rPr>
           <w:b/>
@@ -71,34 +117,85 @@
         <w:t>cpi</w:t>
       </w:r>
       <w:r>
-        <w:t xml:space="preserve">“  </w:t>
-      </w:r>
-      <w:proofErr w:type="gramEnd"/>
-      <w:r>
-        <w:t>that</w:t>
+        <w:t xml:space="preserve">. The </w:t>
+      </w:r>
+      <w:r>
+        <w:rPr>
+          <w:b/>
+          <w:bCs/>
+        </w:rPr>
+        <w:t>date</w:t>
+      </w:r>
+      <w:r>
+        <w:t xml:space="preserve"> column represents a month time interval</w:t>
+      </w:r>
+      <w:r>
+        <w:t>, and is</w:t>
+      </w:r>
+      <w:r>
+        <w:t xml:space="preserve"> formatted as yyyy-mm-01. The </w:t>
+      </w:r>
+      <w:r>
+        <w:rPr>
+          <w:b/>
+          <w:bCs/>
+        </w:rPr>
+        <w:t>cpi</w:t>
+      </w:r>
+      <w:r>
+        <w:t xml:space="preserve"> column represents the Fed Chained Urban CPI index</w:t>
+      </w:r>
+      <w:r>
+        <w:t xml:space="preserve"> value for that month; it</w:t>
+      </w:r>
+      <w:r>
+        <w:t xml:space="preserve"> a positive non-zero floating-point number. The </w:t>
+      </w:r>
+      <w:r>
+        <w:rPr>
+          <w:b/>
+          <w:bCs/>
+        </w:rPr>
+        <w:t>date</w:t>
+      </w:r>
+      <w:r>
+        <w:t xml:space="preserve"> column is in ascending order and typically ranges between 2023-01-01 through 2024-05-01. You will forecast (predict) the CPI value of N future monthly dates, typically</w:t>
+      </w:r>
+      <w:r>
+        <w:t xml:space="preserve"> an array where</w:t>
       </w:r>
       <w:r>
         <w:t xml:space="preserve"> </w:t>
       </w:r>
       <w:r>
-        <w:t>accept</w:t>
-      </w:r>
-      <w:r>
-        <w:t>s</w:t>
-      </w:r>
-      <w:r>
-        <w:t xml:space="preserve"> a </w:t>
-      </w:r>
-      <w:r>
-        <w:t xml:space="preserve">pandas </w:t>
-      </w:r>
-      <w:r>
-        <w:t xml:space="preserve">dataframe </w:t>
-      </w:r>
-      <w:r>
-        <w:t>parameter (</w:t>
-      </w:r>
-      <w:proofErr w:type="spellStart"/>
+        <w:rPr>
+          <w:b/>
+          <w:bCs/>
+        </w:rPr>
+        <w:t>N</w:t>
+      </w:r>
+      <w:r>
+        <w:t xml:space="preserve">=2 (e.g., 2026-06-01 and 2026-07-01). You will then create the output dataframe by appending the N predicted Chained </w:t>
+      </w:r>
+      <w:r>
+        <w:t>Urban CPI</w:t>
+      </w:r>
+      <w:r>
+        <w:t xml:space="preserve"> index values</w:t>
+      </w:r>
+      <w:r>
+        <w:t xml:space="preserve"> and their associated </w:t>
+      </w:r>
+      <w:r>
+        <w:rPr>
+          <w:b/>
+          <w:bCs/>
+        </w:rPr>
+        <w:t>date</w:t>
+      </w:r>
+      <w:r>
+        <w:t xml:space="preserve">s to a copy of the input dataframe </w:t>
+      </w:r>
       <w:r>
         <w:rPr>
           <w:b/>
@@ -106,119 +203,6 @@
         </w:rPr>
         <w:t>df</w:t>
       </w:r>
-      <w:proofErr w:type="spellEnd"/>
-      <w:r>
-        <w:t xml:space="preserve">) </w:t>
-      </w:r>
-      <w:r>
-        <w:t xml:space="preserve">with two columns: </w:t>
-      </w:r>
-      <w:r>
-        <w:rPr>
-          <w:b/>
-          <w:bCs/>
-        </w:rPr>
-        <w:t>date</w:t>
-      </w:r>
-      <w:r>
-        <w:t xml:space="preserve"> and </w:t>
-      </w:r>
-      <w:r>
-        <w:rPr>
-          <w:b/>
-          <w:bCs/>
-        </w:rPr>
-        <w:t>cpi</w:t>
-      </w:r>
-      <w:r>
-        <w:t xml:space="preserve">. The </w:t>
-      </w:r>
-      <w:r>
-        <w:rPr>
-          <w:b/>
-          <w:bCs/>
-        </w:rPr>
-        <w:t>date</w:t>
-      </w:r>
-      <w:r>
-        <w:t xml:space="preserve"> column represents a month time interval</w:t>
-      </w:r>
-      <w:r>
-        <w:t>, and is</w:t>
-      </w:r>
-      <w:r>
-        <w:t xml:space="preserve"> formatted as yyyy-mm-01. The </w:t>
-      </w:r>
-      <w:r>
-        <w:rPr>
-          <w:b/>
-          <w:bCs/>
-        </w:rPr>
-        <w:t>cpi</w:t>
-      </w:r>
-      <w:r>
-        <w:t xml:space="preserve"> column represents the Fed Chained Urban CPI index</w:t>
-      </w:r>
-      <w:r>
-        <w:t xml:space="preserve"> value for that month; it</w:t>
-      </w:r>
-      <w:r>
-        <w:t xml:space="preserve"> a positive non-zero floating-point number. The </w:t>
-      </w:r>
-      <w:r>
-        <w:rPr>
-          <w:b/>
-          <w:bCs/>
-        </w:rPr>
-        <w:t>date</w:t>
-      </w:r>
-      <w:r>
-        <w:t xml:space="preserve"> column is in ascending order and typically ranges between 2023-01-01 through 2024-05-01. You will forecast (predict) the CPI value of N future monthly dates, typically</w:t>
-      </w:r>
-      <w:r>
-        <w:t xml:space="preserve"> an array where</w:t>
-      </w:r>
-      <w:r>
-        <w:t xml:space="preserve"> </w:t>
-      </w:r>
-      <w:r>
-        <w:rPr>
-          <w:b/>
-          <w:bCs/>
-        </w:rPr>
-        <w:t>N</w:t>
-      </w:r>
-      <w:r>
-        <w:t xml:space="preserve">=2 (e.g., 2026-06-01 and 2026-07-01). You will then create the output dataframe by appending the N predicted Chained </w:t>
-      </w:r>
-      <w:r>
-        <w:t>Urban CPI</w:t>
-      </w:r>
-      <w:r>
-        <w:t xml:space="preserve"> index values</w:t>
-      </w:r>
-      <w:r>
-        <w:t xml:space="preserve"> and their associated </w:t>
-      </w:r>
-      <w:r>
-        <w:rPr>
-          <w:b/>
-          <w:bCs/>
-        </w:rPr>
-        <w:t>date</w:t>
-      </w:r>
-      <w:r>
-        <w:t xml:space="preserve">s to a copy of the input dataframe </w:t>
-      </w:r>
-      <w:proofErr w:type="spellStart"/>
-      <w:r>
-        <w:rPr>
-          <w:b/>
-          <w:bCs/>
-        </w:rPr>
-        <w:t>df</w:t>
-      </w:r>
-      <w:proofErr w:type="spellEnd"/>
       <w:r>
         <w:t>, and this new dataframe is the function value to return.</w:t>
       </w:r>
@@ -260,35 +244,18 @@
         <w:t>Augmented_df</w:t>
       </w:r>
       <w:r>
-        <w:t xml:space="preserve">: </w:t>
-      </w:r>
-      <w:proofErr w:type="gramStart"/>
-      <w:r>
-        <w:t>pd.Dataframe</w:t>
-      </w:r>
-      <w:proofErr w:type="gramEnd"/>
-      <w:r>
-        <w:t xml:space="preserve"> = </w:t>
-      </w:r>
-      <w:r>
-        <w:rPr>
-          <w:b/>
-          <w:bCs/>
-        </w:rPr>
-        <w:t>forecast_</w:t>
-      </w:r>
-      <w:proofErr w:type="gramStart"/>
-      <w:r>
-        <w:rPr>
-          <w:b/>
-          <w:bCs/>
-        </w:rPr>
-        <w:t>cpi</w:t>
+        <w:t xml:space="preserve">: pd.Dataframe = </w:t>
+      </w:r>
+      <w:r>
+        <w:rPr>
+          <w:b/>
+          <w:bCs/>
+        </w:rPr>
+        <w:t>forecast_cpi</w:t>
       </w:r>
       <w:r>
         <w:t>(</w:t>
       </w:r>
-      <w:proofErr w:type="gramEnd"/>
       <w:r>
         <w:rPr>
           <w:b/>
@@ -297,15 +264,7 @@
         <w:t>fed_cpi_index</w:t>
       </w:r>
       <w:r>
-        <w:t xml:space="preserve">: </w:t>
-      </w:r>
-      <w:proofErr w:type="gramStart"/>
-      <w:r>
-        <w:t>pd.Dataframe</w:t>
-      </w:r>
-      <w:proofErr w:type="gramEnd"/>
-      <w:r>
-        <w:t xml:space="preserve">, </w:t>
+        <w:t xml:space="preserve">: pd.Dataframe, </w:t>
       </w:r>
       <w:r>
         <w:rPr>
@@ -315,15 +274,7 @@
         <w:t>future_dates</w:t>
       </w:r>
       <w:r>
-        <w:t xml:space="preserve">: list[str]) -&gt; </w:t>
-      </w:r>
-      <w:proofErr w:type="gramStart"/>
-      <w:r>
-        <w:t>pd.Dataframe</w:t>
-      </w:r>
-      <w:proofErr w:type="gramEnd"/>
-      <w:r>
-        <w:t>:</w:t>
+        <w:t>: list[str]) -&gt; pd.Dataframe:</w:t>
       </w:r>
     </w:p>
     <w:p>
@@ -530,13 +481,7 @@
           </w:tcPr>
           <w:p>
             <w:r>
-              <w:t>2026-0</w:t>
-            </w:r>
-            <w:r>
-              <w:t>6</w:t>
-            </w:r>
-            <w:r>
-              <w:t>-01</w:t>
+              <w:t>2026-06-01</w:t>
             </w:r>
           </w:p>
         </w:tc>
@@ -548,13 +493,7 @@
           </w:tcPr>
           <w:p>
             <w:r>
-              <w:t>2026-</w:t>
-            </w:r>
-            <w:r>
-              <w:t>07</w:t>
-            </w:r>
-            <w:r>
-              <w:t>-01</w:t>
+              <w:t>2026-07-01</w:t>
             </w:r>
           </w:p>
         </w:tc>
@@ -817,13 +756,7 @@
         <w:t xml:space="preserve"> [</w:t>
       </w:r>
       <w:r>
-        <w:t>2026-06-01</w:t>
-      </w:r>
-      <w:r>
-        <w:t xml:space="preserve">, </w:t>
-      </w:r>
-      <w:r>
-        <w:t>2026-07-01</w:t>
+        <w:t>2026-06-01, 2026-07-01</w:t>
       </w:r>
       <w:r>
         <w:t xml:space="preserve">] shown in the </w:t>
@@ -833,7 +766,14 @@
           <w:b/>
           <w:bCs/>
         </w:rPr>
-        <w:t>Augmented_df</w:t>
+        <w:t>a</w:t>
+      </w:r>
+      <w:r>
+        <w:rPr>
+          <w:b/>
+          <w:bCs/>
+        </w:rPr>
+        <w:t>ugmented_df</w:t>
       </w:r>
       <w:r>
         <w:rPr>
@@ -1090,21 +1030,7 @@
         <w:rPr>
           <w:rFonts w:ascii="Times New Roman" w:hAnsi="Times New Roman" w:cs="Times New Roman"/>
         </w:rPr>
-        <w:t xml:space="preserve">The relatively small dataset (41 observations) strongly favors statistical time-series models over machine learning methods such as LSTM or </w:t>
-      </w:r>
-      <w:proofErr w:type="spellStart"/>
-      <w:r>
-        <w:rPr>
-          <w:rFonts w:ascii="Times New Roman" w:hAnsi="Times New Roman" w:cs="Times New Roman"/>
-        </w:rPr>
-        <w:t>XGBoost</w:t>
-      </w:r>
-      <w:proofErr w:type="spellEnd"/>
-      <w:r>
-        <w:rPr>
-          <w:rFonts w:ascii="Times New Roman" w:hAnsi="Times New Roman" w:cs="Times New Roman"/>
-        </w:rPr>
-        <w:t>, which generally require much larger training sets.</w:t>
+        <w:t>The relatively small dataset (41 observations) strongly favors statistical time-series models over machine learning methods such as LSTM or XGBoost, which generally require much larger training sets.</w:t>
       </w:r>
       <w:r>
         <w:rPr>
@@ -1278,11 +1204,7 @@
         <w:t>Holt Damped Trend</w:t>
       </w:r>
       <w:r>
-        <w:t>, evaluating them with rolling-origin validation, and optionally averaging their forecasts provides an effective balance of statistical rigor, robustness, and implementation complexity</w:t>
-      </w:r>
-      <w:proofErr w:type="gramStart"/>
-      <w:r>
-        <w:t>.</w:t>
+        <w:t>, evaluating them with rolling-origin validation, and optionally averaging their forecasts provides an effective balance of statistical rigor, robustness, and implementation complexity.</w:t>
       </w:r>
       <w:r>
         <w:t>”</w:t>
@@ -1290,7 +1212,6 @@
       <w:r>
         <w:t>\</w:t>
       </w:r>
-      <w:proofErr w:type="gramEnd"/>
     </w:p>
     <w:p>
       <w:pPr>
@@ -2200,6 +2121,7 @@
   <w:style w:type="character" w:default="1" w:styleId="DefaultParagraphFont">
     <w:name w:val="Default Paragraph Font"/>
     <w:uiPriority w:val="1"/>
+    <w:semiHidden/>
     <w:unhideWhenUsed/>
   </w:style>
   <w:style w:type="table" w:default="1" w:styleId="TableNormal">

</xml_diff>